<commit_message>
Add contest founder and organizer
</commit_message>
<xml_diff>
--- a/Проект_конкурса_Родной_край_глазами_ребенка.docx
+++ b/Проект_конкурса_Родной_край_глазами_ребенка.docx
@@ -45,10 +45,24 @@
         <w:rPr>
           <w:b/>
         </w:rPr>
+        <w:t>Учредитель:</w:t>
+      </w:r>
+      <w:r>
+        <w:t xml:space="preserve"> Министерство культуры Луганской Народной Республики</w:t>
+      </w:r>
+    </w:p>
+    <w:p>
+      <w:pPr>
+        <w:jc w:val="left"/>
+      </w:pPr>
+      <w:r>
+        <w:rPr>
+          <w:b/>
+        </w:rPr>
         <w:t>Организатор:</w:t>
       </w:r>
       <w:r>
-        <w:t xml:space="preserve"> ________________________________________________</w:t>
+        <w:t xml:space="preserve"> Государственное бюджетное учреждение культуры Луганской Народной Республики «Луганский центр народного творчества»</w:t>
       </w:r>
     </w:p>
     <w:p>
@@ -133,7 +147,7 @@
         <w:ind w:firstLine="709"/>
       </w:pPr>
       <w:r>
-        <w:t>1.3. Учредителем Конкурса является ________________________________________________.</w:t>
+        <w:t>1.3. Учредителем Конкурса является Министерство культуры Луганской Народной Республики.</w:t>
       </w:r>
     </w:p>
     <w:p>
@@ -141,7 +155,7 @@
         <w:ind w:firstLine="709"/>
       </w:pPr>
       <w:r>
-        <w:t>1.4. Организатором Конкурса является ________________________________________________.</w:t>
+        <w:t>1.4. Организатором Конкурса является Государственное бюджетное учреждение культуры Луганской Народной Республики «Луганский центр народного творчества».</w:t>
       </w:r>
     </w:p>
     <w:p>
@@ -3458,12 +3472,7 @@
     </w:p>
     <w:p>
       <w:r>
-        <w:t>даю согласие ________________________________________________________________</w:t>
-      </w:r>
-    </w:p>
-    <w:p>
-      <w:r>
-        <w:t>(наименование организатора)</w:t>
+        <w:t>даю согласие Государственному бюджетному учреждению культуры Луганской Народной Республики «Луганский центр народного творчества»</w:t>
       </w:r>
     </w:p>
     <w:p>

</xml_diff>

<commit_message>
Add online application and site QR code
</commit_message>
<xml_diff>
--- a/Проект_конкурса_Родной_край_глазами_ребенка.docx
+++ b/Проект_конкурса_Родной_край_глазами_ребенка.docx
@@ -62,7 +62,7 @@
         <w:t>Организатор:</w:t>
       </w:r>
       <w:r>
-        <w:t xml:space="preserve"> Государственное бюджетное учреждение культуры Луганской Народной Республики «Луганский центр народного творчества»</w:t>
+        <w:t xml:space="preserve"> Государственное бюджетное учреждение культуры Луганской Народной Республики «Луганский республиканский центр народного творчества»</w:t>
       </w:r>
     </w:p>
     <w:p>
@@ -110,7 +110,7 @@
     <w:p>
       <w:pPr>
         <w:sectPr>
-          <w:footerReference w:type="default" r:id="rId9"/>
+          <w:footerReference w:type="default" r:id="rId10"/>
           <w:pgSz w:w="12240" w:h="15840"/>
           <w:pgMar w:top="1134" w:right="850" w:bottom="1134" w:left="1417" w:header="720" w:footer="720" w:gutter="0"/>
           <w:cols w:space="720"/>
@@ -155,7 +155,7 @@
         <w:ind w:firstLine="709"/>
       </w:pPr>
       <w:r>
-        <w:t>1.4. Организатором Конкурса является Государственное бюджетное учреждение культуры Луганской Народной Республики «Луганский центр народного творчества».</w:t>
+        <w:t>1.4. Организатором Конкурса является Государственное бюджетное учреждение культуры Луганской Народной Республики «Луганский республиканский центр народного творчества».</w:t>
       </w:r>
     </w:p>
     <w:p>
@@ -2595,6 +2595,59 @@
     </w:p>
     <w:p>
       <w:pPr>
+        <w:pStyle w:val="Heading1"/>
+        <w:jc w:val="center"/>
+      </w:pPr>
+      <w:r>
+        <w:t>Переход на сайт Конкурса</w:t>
+      </w:r>
+    </w:p>
+    <w:p>
+      <w:r>
+        <w:t>Отсканируйте QR-код камерой телефона, чтобы открыть официальный сайт конкурса и ознакомиться с условиями участия, номинациями и примерами работ.</w:t>
+      </w:r>
+    </w:p>
+    <w:p>
+      <w:pPr>
+        <w:jc w:val="center"/>
+      </w:pPr>
+      <w:r>
+        <w:drawing>
+          <wp:inline xmlns:a="http://schemas.openxmlformats.org/drawingml/2006/main" xmlns:pic="http://schemas.openxmlformats.org/drawingml/2006/picture">
+            <wp:extent cx="2011680" cy="2011680"/>
+            <wp:docPr id="1" name="Picture 1"/>
+            <wp:cNvGraphicFramePr>
+              <a:graphicFrameLocks noChangeAspect="1"/>
+            </wp:cNvGraphicFramePr>
+            <a:graphic>
+              <a:graphicData uri="http://schemas.openxmlformats.org/drawingml/2006/picture">
+                <pic:pic>
+                  <pic:nvPicPr>
+                    <pic:cNvPr id="0" name="qr-code-site.png"/>
+                    <pic:cNvPicPr/>
+                  </pic:nvPicPr>
+                  <pic:blipFill>
+                    <a:blip r:embed="rId9"/>
+                    <a:stretch>
+                      <a:fillRect/>
+                    </a:stretch>
+                  </pic:blipFill>
+                  <pic:spPr>
+                    <a:xfrm>
+                      <a:off x="0" y="0"/>
+                      <a:ext cx="2011680" cy="2011680"/>
+                    </a:xfrm>
+                    <a:prstGeom prst="rect"/>
+                  </pic:spPr>
+                </pic:pic>
+              </a:graphicData>
+            </a:graphic>
+          </wp:inline>
+        </w:drawing>
+      </w:r>
+    </w:p>
+    <w:p>
+      <w:pPr>
         <w:sectPr>
           <w:pgSz w:w="12240" w:h="15840"/>
           <w:pgMar w:top="1134" w:right="850" w:bottom="1134" w:left="1417" w:header="720" w:footer="720" w:gutter="0"/>
@@ -3472,7 +3525,7 @@
     </w:p>
     <w:p>
       <w:r>
-        <w:t>даю согласие Государственному бюджетному учреждению культуры Луганской Народной Республики «Луганский центр народного творчества»</w:t>
+        <w:t>даю согласие Государственному бюджетному учреждению культуры Луганской Народной Республики «Луганский республиканский центр народного творчества»</w:t>
       </w:r>
     </w:p>
     <w:p>

</xml_diff>